<commit_message>
fix glb access about psum
</commit_message>
<xml_diff>
--- a/Formula for linear layer.docx
+++ b/Formula for linear layer.docx
@@ -2839,8 +2839,17 @@
           <w:rFonts w:hint="eastAsia"/>
           <w:lang w:eastAsia="zh-CN"/>
         </w:rPr>
-        <w:t>eight stationary</w:t>
+        <w:t xml:space="preserve">eight </w:t>
       </w:r>
+      <w:proofErr w:type="gramStart"/>
+      <w:r>
+        <w:rPr>
+          <w:rFonts w:hint="eastAsia"/>
+          <w:lang w:eastAsia="zh-CN"/>
+        </w:rPr>
+        <w:t>stationary</w:t>
+      </w:r>
+      <w:proofErr w:type="gramEnd"/>
     </w:p>
     <w:p>
       <w:pPr>
@@ -5711,8 +5720,17 @@
           <w:rFonts w:hint="eastAsia"/>
           <w:lang w:eastAsia="zh-CN"/>
         </w:rPr>
-        <w:t>nput stationary</w:t>
+        <w:t xml:space="preserve">nput </w:t>
       </w:r>
+      <w:proofErr w:type="gramStart"/>
+      <w:r>
+        <w:rPr>
+          <w:rFonts w:hint="eastAsia"/>
+          <w:lang w:eastAsia="zh-CN"/>
+        </w:rPr>
+        <w:t>stationary</w:t>
+      </w:r>
+      <w:proofErr w:type="gramEnd"/>
     </w:p>
     <w:p>
       <w:pPr>
@@ -8676,7 +8694,7 @@
           <w:lang w:eastAsia="zh-CN"/>
         </w:rPr>
         <w:drawing>
-          <wp:inline distT="0" distB="0" distL="0" distR="0" wp14:anchorId="5EF7E51A" wp14:editId="619E50B4">
+          <wp:inline distT="0" distB="0" distL="0" distR="0" wp14:anchorId="5EF7E51A" wp14:editId="67F9B3FD">
             <wp:extent cx="5271135" cy="3437255"/>
             <wp:effectExtent l="0" t="0" r="5715" b="0"/>
             <wp:docPr id="2121954812" name="圖片 5"/>
@@ -8848,6 +8866,7 @@
       <w:pPr>
         <w:rPr>
           <w:rFonts w:eastAsia="DengXian"/>
+          <w:noProof/>
           <w:lang w:eastAsia="zh-CN"/>
         </w:rPr>
       </w:pPr>
@@ -8859,6 +8878,64 @@
           <w:lang w:eastAsia="zh-CN"/>
         </w:rPr>
       </w:pPr>
+      <w:r>
+        <w:rPr>
+          <w:noProof/>
+        </w:rPr>
+        <w:drawing>
+          <wp:inline distT="0" distB="0" distL="0" distR="0" wp14:anchorId="522CDE2A" wp14:editId="0F4679DD">
+            <wp:extent cx="5423026" cy="1380654"/>
+            <wp:effectExtent l="0" t="0" r="0" b="0"/>
+            <wp:docPr id="1743498514" name="圖片 1" descr="一張含有 文字, 螢幕擷取畫面, 字型, 數字 的圖片&#10;&#10;AI 產生的內容可能不正確。"/>
+            <wp:cNvGraphicFramePr>
+              <a:graphicFrameLocks xmlns:a="http://schemas.openxmlformats.org/drawingml/2006/main" noChangeAspect="1"/>
+            </wp:cNvGraphicFramePr>
+            <a:graphic xmlns:a="http://schemas.openxmlformats.org/drawingml/2006/main">
+              <a:graphicData uri="http://schemas.openxmlformats.org/drawingml/2006/picture">
+                <pic:pic xmlns:pic="http://schemas.openxmlformats.org/drawingml/2006/picture">
+                  <pic:nvPicPr>
+                    <pic:cNvPr id="1743498514" name="圖片 1" descr="一張含有 文字, 螢幕擷取畫面, 字型, 數字 的圖片&#10;&#10;AI 產生的內容可能不正確。"/>
+                    <pic:cNvPicPr>
+                      <a:picLocks noChangeAspect="1" noChangeArrowheads="1"/>
+                    </pic:cNvPicPr>
+                  </pic:nvPicPr>
+                  <pic:blipFill rotWithShape="1">
+                    <a:blip r:embed="rId11" cstate="print">
+                      <a:extLst>
+                        <a:ext uri="{28A0092B-C50C-407E-A947-70E740481C1C}">
+                          <a14:useLocalDpi xmlns:a14="http://schemas.microsoft.com/office/drawing/2010/main" val="0"/>
+                        </a:ext>
+                      </a:extLst>
+                    </a:blip>
+                    <a:srcRect l="1" t="41389" r="-2846" b="20919"/>
+                    <a:stretch>
+                      <a:fillRect/>
+                    </a:stretch>
+                  </pic:blipFill>
+                  <pic:spPr bwMode="auto">
+                    <a:xfrm>
+                      <a:off x="0" y="0"/>
+                      <a:ext cx="5424438" cy="1381013"/>
+                    </a:xfrm>
+                    <a:prstGeom prst="rect">
+                      <a:avLst/>
+                    </a:prstGeom>
+                    <a:noFill/>
+                    <a:ln>
+                      <a:noFill/>
+                    </a:ln>
+                    <a:extLst>
+                      <a:ext uri="{53640926-AAD7-44D8-BBD7-CCE9431645EC}">
+                        <a14:shadowObscured xmlns:a14="http://schemas.microsoft.com/office/drawing/2010/main"/>
+                      </a:ext>
+                    </a:extLst>
+                  </pic:spPr>
+                </pic:pic>
+              </a:graphicData>
+            </a:graphic>
+          </wp:inline>
+        </w:drawing>
+      </w:r>
     </w:p>
     <w:p>
       <w:pPr>
@@ -8883,6 +8960,15 @@
           <w:lang w:eastAsia="zh-CN"/>
         </w:rPr>
       </w:pPr>
+    </w:p>
+    <w:p>
+      <w:pPr>
+        <w:rPr>
+          <w:rFonts w:eastAsia="DengXian"/>
+          <w:lang w:eastAsia="zh-CN"/>
+        </w:rPr>
+      </w:pPr>
+      <w:proofErr w:type="spellStart"/>
       <w:r>
         <w:rPr>
           <w:rFonts w:eastAsia="DengXian"/>
@@ -8897,6 +8983,7 @@
         </w:rPr>
         <w:t>rc</w:t>
       </w:r>
+      <w:proofErr w:type="spellEnd"/>
     </w:p>
     <w:p>
       <w:pPr>
@@ -8989,15 +9076,7 @@
           <w:rFonts w:eastAsia="DengXian" w:hint="eastAsia"/>
           <w:lang w:eastAsia="zh-CN"/>
         </w:rPr>
-        <w:t>預計都用這個的，</w:t>
-      </w:r>
-      <w:r>
-        <w:rPr>
-          <w:rFonts w:eastAsia="DengXian" w:hint="eastAsia"/>
-          <w:lang w:eastAsia="zh-CN"/>
-        </w:rPr>
-        <w:lastRenderedPageBreak/>
-        <w:t>只是</w:t>
+        <w:t>預計都用這個的，只是</w:t>
       </w:r>
       <w:r>
         <w:rPr>
@@ -9057,12 +9136,21 @@
         </w:rPr>
         <w:t>在模擬的時候的用法，由</w:t>
       </w:r>
+      <w:proofErr w:type="spellStart"/>
       <w:r>
         <w:rPr>
           <w:rFonts w:eastAsia="DengXian" w:hint="eastAsia"/>
           <w:lang w:eastAsia="zh-CN"/>
         </w:rPr>
-        <w:t>read_data()</w:t>
+        <w:t>read_data</w:t>
+      </w:r>
+      <w:proofErr w:type="spellEnd"/>
+      <w:r>
+        <w:rPr>
+          <w:rFonts w:eastAsia="DengXian" w:hint="eastAsia"/>
+          <w:lang w:eastAsia="zh-CN"/>
+        </w:rPr>
+        <w:t>()</w:t>
       </w:r>
       <w:r>
         <w:rPr>
@@ -9071,12 +9159,21 @@
         </w:rPr>
         <w:t>和</w:t>
       </w:r>
+      <w:proofErr w:type="spellStart"/>
       <w:r>
         <w:rPr>
           <w:rFonts w:eastAsia="DengXian" w:hint="eastAsia"/>
           <w:lang w:eastAsia="zh-CN"/>
         </w:rPr>
-        <w:t>write_data()</w:t>
+        <w:t>write_data</w:t>
+      </w:r>
+      <w:proofErr w:type="spellEnd"/>
+      <w:r>
+        <w:rPr>
+          <w:rFonts w:eastAsia="DengXian" w:hint="eastAsia"/>
+          <w:lang w:eastAsia="zh-CN"/>
+        </w:rPr>
+        <w:t>()</w:t>
       </w:r>
       <w:r>
         <w:rPr>
@@ -9136,6 +9233,7 @@
         </w:rPr>
         <w:tab/>
       </w:r>
+      <w:proofErr w:type="spellStart"/>
       <w:r>
         <w:rPr>
           <w:rFonts w:eastAsia="DengXian" w:hint="eastAsia"/>
@@ -9143,6 +9241,7 @@
         </w:rPr>
         <w:t>tb_pe_array</w:t>
       </w:r>
+      <w:proofErr w:type="spellEnd"/>
     </w:p>
     <w:p>
       <w:pPr>

</xml_diff>

<commit_message>
fix mapper_base with include memory
</commit_message>
<xml_diff>
--- a/Formula for linear layer.docx
+++ b/Formula for linear layer.docx
@@ -2839,8 +2839,17 @@
           <w:rFonts w:hint="eastAsia"/>
           <w:lang w:eastAsia="zh-CN"/>
         </w:rPr>
-        <w:t>eight stationary</w:t>
+        <w:t xml:space="preserve">eight </w:t>
       </w:r>
+      <w:proofErr w:type="gramStart"/>
+      <w:r>
+        <w:rPr>
+          <w:rFonts w:hint="eastAsia"/>
+          <w:lang w:eastAsia="zh-CN"/>
+        </w:rPr>
+        <w:t>stationary</w:t>
+      </w:r>
+      <w:proofErr w:type="gramEnd"/>
     </w:p>
     <w:p>
       <w:pPr>
@@ -5711,8 +5720,17 @@
           <w:rFonts w:hint="eastAsia"/>
           <w:lang w:eastAsia="zh-CN"/>
         </w:rPr>
-        <w:t>nput stationary</w:t>
+        <w:t xml:space="preserve">nput </w:t>
       </w:r>
+      <w:proofErr w:type="gramStart"/>
+      <w:r>
+        <w:rPr>
+          <w:rFonts w:hint="eastAsia"/>
+          <w:lang w:eastAsia="zh-CN"/>
+        </w:rPr>
+        <w:t>stationary</w:t>
+      </w:r>
+      <w:proofErr w:type="gramEnd"/>
     </w:p>
     <w:p>
       <w:pPr>
@@ -8676,7 +8694,7 @@
           <w:lang w:eastAsia="zh-CN"/>
         </w:rPr>
         <w:drawing>
-          <wp:inline distT="0" distB="0" distL="0" distR="0" wp14:anchorId="5EF7E51A" wp14:editId="47279467">
+          <wp:inline distT="0" distB="0" distL="0" distR="0" wp14:anchorId="5EF7E51A" wp14:editId="47A66486">
             <wp:extent cx="5271135" cy="3437255"/>
             <wp:effectExtent l="0" t="0" r="5715" b="0"/>
             <wp:docPr id="2121954812" name="圖片 5"/>
@@ -8687,7 +8705,7 @@
               <a:graphicData uri="http://schemas.openxmlformats.org/drawingml/2006/picture">
                 <pic:pic xmlns:pic="http://schemas.openxmlformats.org/drawingml/2006/picture">
                   <pic:nvPicPr>
-                    <pic:cNvPr id="0" name="Picture 5"/>
+                    <pic:cNvPr id="2121954812" name="圖片 5"/>
                     <pic:cNvPicPr>
                       <a:picLocks noChangeAspect="1" noChangeArrowheads="1"/>
                     </pic:cNvPicPr>
@@ -8740,7 +8758,7 @@
         </w:rPr>
         <w:lastRenderedPageBreak/>
         <w:drawing>
-          <wp:inline distT="0" distB="0" distL="0" distR="0" wp14:anchorId="3D09BE9F" wp14:editId="2743517F">
+          <wp:inline distT="0" distB="0" distL="0" distR="0" wp14:anchorId="3D09BE9F" wp14:editId="7287438A">
             <wp:extent cx="5271135" cy="3642995"/>
             <wp:effectExtent l="0" t="0" r="5715" b="0"/>
             <wp:docPr id="444109740" name="圖片 1"/>
@@ -8751,7 +8769,7 @@
               <a:graphicData uri="http://schemas.openxmlformats.org/drawingml/2006/picture">
                 <pic:pic xmlns:pic="http://schemas.openxmlformats.org/drawingml/2006/picture">
                   <pic:nvPicPr>
-                    <pic:cNvPr id="0" name="Picture 1"/>
+                    <pic:cNvPr id="444109740" name="圖片 1"/>
                     <pic:cNvPicPr>
                       <a:picLocks noChangeAspect="1" noChangeArrowheads="1"/>
                     </pic:cNvPicPr>
@@ -8950,6 +8968,7 @@
           <w:lang w:eastAsia="zh-CN"/>
         </w:rPr>
       </w:pPr>
+      <w:proofErr w:type="spellStart"/>
       <w:r>
         <w:rPr>
           <w:rFonts w:eastAsia="DengXian"/>
@@ -8964,6 +8983,7 @@
         </w:rPr>
         <w:t>rc</w:t>
       </w:r>
+      <w:proofErr w:type="spellEnd"/>
     </w:p>
     <w:p>
       <w:pPr>
@@ -9116,12 +9136,21 @@
         </w:rPr>
         <w:t>在模擬的時候的用法，由</w:t>
       </w:r>
+      <w:proofErr w:type="spellStart"/>
       <w:r>
         <w:rPr>
           <w:rFonts w:eastAsia="DengXian" w:hint="eastAsia"/>
           <w:lang w:eastAsia="zh-CN"/>
         </w:rPr>
-        <w:t>read_data()</w:t>
+        <w:t>read_data</w:t>
+      </w:r>
+      <w:proofErr w:type="spellEnd"/>
+      <w:r>
+        <w:rPr>
+          <w:rFonts w:eastAsia="DengXian" w:hint="eastAsia"/>
+          <w:lang w:eastAsia="zh-CN"/>
+        </w:rPr>
+        <w:t>()</w:t>
       </w:r>
       <w:r>
         <w:rPr>
@@ -9130,12 +9159,21 @@
         </w:rPr>
         <w:t>和</w:t>
       </w:r>
+      <w:proofErr w:type="spellStart"/>
       <w:r>
         <w:rPr>
           <w:rFonts w:eastAsia="DengXian" w:hint="eastAsia"/>
           <w:lang w:eastAsia="zh-CN"/>
         </w:rPr>
-        <w:t>write_data()</w:t>
+        <w:t>write_data</w:t>
+      </w:r>
+      <w:proofErr w:type="spellEnd"/>
+      <w:r>
+        <w:rPr>
+          <w:rFonts w:eastAsia="DengXian" w:hint="eastAsia"/>
+          <w:lang w:eastAsia="zh-CN"/>
+        </w:rPr>
+        <w:t>()</w:t>
       </w:r>
       <w:r>
         <w:rPr>
@@ -9195,6 +9233,7 @@
         </w:rPr>
         <w:tab/>
       </w:r>
+      <w:proofErr w:type="spellStart"/>
       <w:r>
         <w:rPr>
           <w:rFonts w:eastAsia="DengXian" w:hint="eastAsia"/>
@@ -9202,6 +9241,7 @@
         </w:rPr>
         <w:t>tb_pe_array</w:t>
       </w:r>
+      <w:proofErr w:type="spellEnd"/>
     </w:p>
     <w:p>
       <w:pPr>

</xml_diff>